<commit_message>
Adapt manuscript for transfer to Discover Health Systems
- Abstract shortened to 225 words (journal limit 250) and rewritten as
  a single paragraph
- Mediation described as statistical mediation in cross-sectional data,
  in the abstract, H4 and the statistical analysis section, answering
  the BMC Health Services Research editorial decision
- Declarations headings renamed to Data availability and Author
  contributions
- Cover letter addressed to Discover Health Systems
</commit_message>
<xml_diff>
--- a/manuscript/build/cover_letter.docx
+++ b/manuscript/build/cover_letter.docx
@@ -8,6 +8,72 @@
       </w:pPr>
       <w:r>
         <w:t xml:space="preserve">The Editor</w:t>
+      </w:r>
+      <w:r>
+        <w:t xml:space="preserve"> </w:t>
+      </w:r>
+      <w:r>
+        <w:rPr>
+          <w:iCs/>
+          <w:i/>
+        </w:rPr>
+        <w:t xml:space="preserve">Discover Health Systems</w:t>
+      </w:r>
+    </w:p>
+    <w:p>
+      <w:pPr>
+        <w:pStyle w:val="BodyText"/>
+      </w:pPr>
+      <w:r>
+        <w:t xml:space="preserve">Dear Editor,</w:t>
+      </w:r>
+    </w:p>
+    <w:p>
+      <w:pPr>
+        <w:pStyle w:val="BodyText"/>
+      </w:pPr>
+      <w:r>
+        <w:t xml:space="preserve">We are pleased to submit our manuscript,</w:t>
+      </w:r>
+      <w:r>
+        <w:t xml:space="preserve"> </w:t>
+      </w:r>
+      <w:r>
+        <w:rPr>
+          <w:bCs/>
+          <w:b/>
+        </w:rPr>
+        <w:t xml:space="preserve">“</w:t>
+      </w:r>
+      <w:r>
+        <w:rPr>
+          <w:bCs/>
+          <w:b/>
+        </w:rPr>
+        <w:t xml:space="preserve">Strategic Planning and Institutional Resilience in Cairo’s Health Sector: Examining the Mediating Role of Capacity Development in the Context of Environmental Crisis Management</w:t>
+      </w:r>
+      <w:r>
+        <w:rPr>
+          <w:bCs/>
+          <w:b/>
+        </w:rPr>
+        <w:t xml:space="preserve">”</w:t>
+      </w:r>
+      <w:r>
+        <w:t xml:space="preserve">, for consideration as a Research article in</w:t>
+      </w:r>
+      <w:r>
+        <w:t xml:space="preserve"> </w:t>
+      </w:r>
+      <w:r>
+        <w:rPr>
+          <w:iCs/>
+          <w:i/>
+        </w:rPr>
+        <w:t xml:space="preserve">Discover Health Systems</w:t>
+      </w:r>
+      <w:r>
+        <w:t xml:space="preserve">. The manuscript comes to you through the Springer Nature transfer service from</w:t>
       </w:r>
       <w:r>
         <w:t xml:space="preserve"> </w:t>
@@ -19,13 +85,16 @@
         </w:rPr>
         <w:t xml:space="preserve">BMC Health Services Research</w:t>
       </w:r>
+      <w:r>
+        <w:t xml:space="preserve">.</w:t>
+      </w:r>
     </w:p>
     <w:p>
       <w:pPr>
         <w:pStyle w:val="BodyText"/>
       </w:pPr>
       <w:r>
-        <w:t xml:space="preserve">Dear Editor,</w:t>
+        <w:t xml:space="preserve">Heatwaves, flooding and air pollution increasingly disrupt health services, and health institutions are expected to plan for them. Yet there is little quantitative evidence on how planning becomes resilience, particularly in North African megacities. Using a bilingual survey of 416 health-sector managers in Cairo, Egypt, we examined how environment-aware strategic planning, capacity development (training, earmarked resources, climate-relevant infrastructure and interdepartmental cooperation) and institutional resilience are related.</w:t>
       </w:r>
     </w:p>
     <w:p>
@@ -33,38 +102,49 @@
         <w:pStyle w:val="BodyText"/>
       </w:pPr>
       <w:r>
-        <w:t xml:space="preserve">We are pleased to submit our manuscript,</w:t>
-      </w:r>
-      <w:r>
-        <w:t xml:space="preserve"> </w:t>
-      </w:r>
-      <w:r>
-        <w:rPr>
-          <w:bCs/>
-          <w:b/>
-        </w:rPr>
-        <w:t xml:space="preserve">“</w:t>
-      </w:r>
-      <w:r>
-        <w:rPr>
-          <w:bCs/>
-          <w:b/>
-        </w:rPr>
-        <w:t xml:space="preserve">Strategic Planning and Institutional Resilience in Cairo’s Health Sector: Examining the Mediating Role of Capacity Development in the Context of Environmental Crisis Management</w:t>
-      </w:r>
-      <w:r>
-        <w:rPr>
-          <w:bCs/>
-          <w:b/>
-        </w:rPr>
-        <w:t xml:space="preserve">”</w:t>
-      </w:r>
-      <w:r>
-        <w:t xml:space="preserve">, for consideration as a Research Article in</w:t>
-      </w:r>
-      <w:r>
-        <w:t xml:space="preserve"> </w:t>
-      </w:r>
+        <w:t xml:space="preserve">The main findings are:</w:t>
+      </w:r>
+    </w:p>
+    <w:p>
+      <w:pPr>
+        <w:numPr>
+          <w:ilvl w:val="0"/>
+          <w:numId w:val="1001"/>
+        </w:numPr>
+        <w:pStyle w:val="Compact"/>
+      </w:pPr>
+      <w:r>
+        <w:t xml:space="preserve">Strategic planning was associated with resilience almost entirely through capacity development (indirect β = 0.84, 95% CI 0.69–1.00), with no detectable direct association.</w:t>
+      </w:r>
+    </w:p>
+    <w:p>
+      <w:pPr>
+        <w:numPr>
+          <w:ilvl w:val="0"/>
+          <w:numId w:val="1001"/>
+        </w:numPr>
+        <w:pStyle w:val="Compact"/>
+      </w:pPr>
+      <w:r>
+        <w:t xml:space="preserve">The pattern held among screened respondents, after excluding uniform and possible repeat submissions, after adjusting for respondent characteristics, and after modelling a common-method factor.</w:t>
+      </w:r>
+    </w:p>
+    <w:p>
+      <w:pPr>
+        <w:numPr>
+          <w:ilvl w:val="0"/>
+          <w:numId w:val="1001"/>
+        </w:numPr>
+        <w:pStyle w:val="Compact"/>
+      </w:pPr>
+      <w:r>
+        <w:t xml:space="preserve">We report the study’s limitations openly: capacity development and resilience are highly correlated as measured, a reverse-order model fits equally well, and responses cluster at the scale maximum.</w:t>
+      </w:r>
+    </w:p>
+    <w:p>
+      <w:pPr>
+        <w:pStyle w:val="FirstParagraph"/>
+      </w:pPr>
       <w:r>
         <w:rPr>
           <w:iCs/>
@@ -73,7 +153,10 @@
         <w:t xml:space="preserve">BMC Health Services Research</w:t>
       </w:r>
       <w:r>
-        <w:t xml:space="preserve">.</w:t>
+        <w:t xml:space="preserve"> </w:t>
+      </w:r>
+      <w:r>
+        <w:t xml:space="preserve">declined to send the manuscript for review because a cross-sectional design cannot support causal mediation. We agree, and the manuscript now states explicitly in the abstract and methods that the model is a statistical mediation model. It shows how the associations are structured; it does not establish temporal or causal order. The manuscript reports the equivalent reverse-order model and calls for longitudinal, multi-source studies to test causality.</w:t>
       </w:r>
     </w:p>
     <w:p>
@@ -81,59 +164,7 @@
         <w:pStyle w:val="BodyText"/>
       </w:pPr>
       <w:r>
-        <w:t xml:space="preserve">Heatwaves, flooding and air pollution increasingly disrupt health services, and health institutions are expected to plan for them. Yet there is little quantitative evidence on how planning becomes resilience, particularly in North African megacities. Using a bilingual survey of 416 health-sector managers in Cairo, Egypt, we tested whether capacity development (training, earmarked resources, climate-relevant infrastructure and interdepartmental cooperation) mediates the association between environment-aware strategic planning and institutional resilience.</w:t>
-      </w:r>
-    </w:p>
-    <w:p>
-      <w:pPr>
-        <w:pStyle w:val="BodyText"/>
-      </w:pPr>
-      <w:r>
-        <w:t xml:space="preserve">The main findings are:</w:t>
-      </w:r>
-    </w:p>
-    <w:p>
-      <w:pPr>
-        <w:numPr>
-          <w:ilvl w:val="0"/>
-          <w:numId w:val="1001"/>
-        </w:numPr>
-        <w:pStyle w:val="Compact"/>
-      </w:pPr>
-      <w:r>
-        <w:t xml:space="preserve">Strategic planning was associated with resilience almost entirely through capacity development (indirect β = 0.84, 95% CI 0.69–1.00), with no detectable direct association.</w:t>
-      </w:r>
-    </w:p>
-    <w:p>
-      <w:pPr>
-        <w:numPr>
-          <w:ilvl w:val="0"/>
-          <w:numId w:val="1001"/>
-        </w:numPr>
-        <w:pStyle w:val="Compact"/>
-      </w:pPr>
-      <w:r>
-        <w:t xml:space="preserve">The pattern held in screened respondents, after excluding uniform and repeat submissions, after adjusting for respondent characteristics, and after modelling a common-method factor.</w:t>
-      </w:r>
-    </w:p>
-    <w:p>
-      <w:pPr>
-        <w:numPr>
-          <w:ilvl w:val="0"/>
-          <w:numId w:val="1001"/>
-        </w:numPr>
-        <w:pStyle w:val="Compact"/>
-      </w:pPr>
-      <w:r>
-        <w:t xml:space="preserve">We report the study’s limitations openly: capacity development and resilience are highly correlated as measured, an equivalent reverse-order model fits equally well, and responses cluster at the scale maximum. We interpret the findings accordingly, as identifying priorities rather than establishing causation.</w:t>
-      </w:r>
-    </w:p>
-    <w:p>
-      <w:pPr>
-        <w:pStyle w:val="FirstParagraph"/>
-      </w:pPr>
-      <w:r>
-        <w:t xml:space="preserve">We believe the work suits the journal’s readership because it addresses the organisational processes that link preparedness planning to health-service resilience, and it gives managers and regulators concrete, monitorable targets. The study follows the STROBE and CHERRIES reporting guidelines (completed checklists provided to the editor as related files). The anonymised dataset, codebook and complete analysis code are openly available at https://github.com/A2022KR/strategic-planning-resilience-egypt.</w:t>
+        <w:t xml:space="preserve">We believe the work fits the journal’s focus on the organisational management of health systems, capacity building in low- and middle-income countries, and disaster planning and response. It also bridges health-outcome and management perspectives, as the journal encourages, and gives managers and regulators concrete, monitorable targets. The study follows the STROBE and CHERRIES reporting guidelines; the completed checklists are provided to the editor as related files. The anonymised dataset, codebook and complete analysis code are openly available at https://github.com/A2022KR/strategic-planning-resilience-egypt.</w:t>
       </w:r>
     </w:p>
     <w:p>

</xml_diff>